<commit_message>
Fix PID Procedure overview table vanishing in render; re-bake ToC pages
A render check of every paragraph found LibreOffice dropped rows 2-7 of
the PID Procedure's "Overview of the disclosure process" table: a table
of can't-split rows breaking between rows just above a Heading 1 hits a
layout loop LibreOffice abandons. The ToC page numbers had been
harvested from that broken layout, so sections 11-17 read a page early.

The table is now kept on one page with its heading, and lead-in
paragraphs ending in ":" stay with the table or list they introduce.
The builder emits both rules; since the template package was not
available for a rebuild, 08_09_layout_patch.py applied them to the
built files and re-baked the ToC from a fresh render. Both documents
now render every paragraph. Text is unchanged.

Co-Authored-By: Claude Opus 5.5 <noreply@anthropic.com>
Claude-Session: https://claude.ai/code/session_019uHiQpoQ3ZD23SPjaqoKRp
</commit_message>
<xml_diff>
--- a/Public_Interest_Disclosure_Procedure_reskinned.docx
+++ b/Public_Interest_Disclosure_Procedure_reskinned.docx
@@ -1978,7 +1978,7 @@
           <w:fldChar w:fldCharType="separate"/>
         </w:r>
         <w:r>
-          <w:t xml:space="preserve">15</w:t>
+          <w:t xml:space="preserve">16</w:t>
         </w:r>
         <w:r>
           <w:fldChar w:fldCharType="end"/>
@@ -2021,7 +2021,7 @@
           <w:fldChar w:fldCharType="separate"/>
         </w:r>
         <w:r>
-          <w:t xml:space="preserve">16</w:t>
+          <w:t xml:space="preserve">17</w:t>
         </w:r>
         <w:r>
           <w:fldChar w:fldCharType="end"/>
@@ -2064,7 +2064,7 @@
           <w:fldChar w:fldCharType="separate"/>
         </w:r>
         <w:r>
-          <w:t xml:space="preserve">16</w:t>
+          <w:t xml:space="preserve">17</w:t>
         </w:r>
         <w:r>
           <w:fldChar w:fldCharType="end"/>
@@ -2107,7 +2107,7 @@
           <w:fldChar w:fldCharType="separate"/>
         </w:r>
         <w:r>
-          <w:t xml:space="preserve">16</w:t>
+          <w:t xml:space="preserve">17</w:t>
         </w:r>
         <w:r>
           <w:fldChar w:fldCharType="end"/>
@@ -2150,7 +2150,7 @@
           <w:fldChar w:fldCharType="separate"/>
         </w:r>
         <w:r>
-          <w:t xml:space="preserve">17</w:t>
+          <w:t xml:space="preserve">18</w:t>
         </w:r>
         <w:r>
           <w:fldChar w:fldCharType="end"/>
@@ -2193,7 +2193,7 @@
           <w:fldChar w:fldCharType="separate"/>
         </w:r>
         <w:r>
-          <w:t xml:space="preserve">17</w:t>
+          <w:t xml:space="preserve">18</w:t>
         </w:r>
         <w:r>
           <w:fldChar w:fldCharType="end"/>
@@ -2236,7 +2236,7 @@
           <w:fldChar w:fldCharType="separate"/>
         </w:r>
         <w:r>
-          <w:t xml:space="preserve">17</w:t>
+          <w:t xml:space="preserve">18</w:t>
         </w:r>
         <w:r>
           <w:fldChar w:fldCharType="end"/>
@@ -2308,7 +2308,9 @@
       </w:r>
     </w:p>
     <w:p>
-      <w:pPr/>
+      <w:pPr>
+        <w:keepNext/>
+      </w:pPr>
       <w:r>
         <w:t xml:space="preserve">This procedure:</w:t>
       </w:r>
@@ -2443,7 +2445,9 @@
       </w:r>
     </w:p>
     <w:p>
-      <w:pPr/>
+      <w:pPr>
+        <w:keepNext/>
+      </w:pPr>
       <w:r>
         <w:t xml:space="preserve">The PID Act aims to:</w:t>
       </w:r>
@@ -2504,7 +2508,9 @@
       <w:bookmarkEnd w:id="9104"/>
     </w:p>
     <w:p>
-      <w:pPr/>
+      <w:pPr>
+        <w:keepNext/>
+      </w:pPr>
       <w:r>
         <w:t xml:space="preserve">A public interest disclosure is a report made by a person about information that shows or tends to show, or information that the person making the report reasonably believes shows to tends to show:</w:t>
       </w:r>
@@ -2564,7 +2570,9 @@
       </w:r>
     </w:p>
     <w:p>
-      <w:pPr/>
+      <w:pPr>
+        <w:keepNext/>
+      </w:pPr>
       <w:r>
         <w:t xml:space="preserve">Improper conduct involves conduct by a public officer or public body in their official capacity. It includes:</w:t>
       </w:r>
@@ -2839,7 +2847,9 @@
       </w:r>
     </w:p>
     <w:p>
-      <w:pPr/>
+      <w:pPr>
+        <w:keepNext/>
+      </w:pPr>
       <w:r>
         <w:t xml:space="preserve">It is an offence under the PID Act for a person to take detrimental action against another person in reprisal for a public interest disclosure. Detrimental action includes:</w:t>
       </w:r>
@@ -3036,7 +3046,9 @@
       </w:r>
     </w:p>
     <w:p>
-      <w:pPr/>
+      <w:pPr>
+        <w:keepNext/>
+      </w:pPr>
       <w:r>
         <w:t xml:space="preserve">The following </w:t>
       </w:r>
@@ -3141,7 +3153,9 @@
       </w:r>
     </w:p>
     <w:p>
-      <w:pPr/>
+      <w:pPr>
+        <w:keepNext/>
+      </w:pPr>
       <w:r>
         <w:t xml:space="preserve">Disclosures must be made to an entity authorised to receive them. The table below summarises who can receive different types of disclosures:</w:t>
       </w:r>
@@ -3448,7 +3462,9 @@
       </w:r>
     </w:p>
     <w:p>
-      <w:pPr/>
+      <w:pPr>
+        <w:keepNext/>
+      </w:pPr>
       <w:r>
         <w:t xml:space="preserve">When making a disclosure it is helpful to provide:</w:t>
       </w:r>
@@ -3519,7 +3535,9 @@
       </w:r>
     </w:p>
     <w:p>
-      <w:pPr/>
+      <w:pPr>
+        <w:keepNext/>
+      </w:pPr>
       <w:r>
         <w:t xml:space="preserve">An oral disclosure to Council must be made in private and may be made:</w:t>
       </w:r>
@@ -3589,7 +3607,9 @@
       </w:r>
     </w:p>
     <w:p>
-      <w:pPr/>
+      <w:pPr>
+        <w:keepNext/>
+      </w:pPr>
       <w:r>
         <w:t xml:space="preserve">A written disclosure to Council must be:</w:t>
       </w:r>
@@ -3670,7 +3690,9 @@
       </w:r>
     </w:p>
     <w:p>
-      <w:pPr/>
+      <w:pPr>
+        <w:keepNext/>
+      </w:pPr>
       <w:r>
         <w:t xml:space="preserve">Disclosures can be made anonymously. This can be done by:</w:t>
       </w:r>
@@ -3729,7 +3751,9 @@
       </w:r>
     </w:p>
     <w:p>
-      <w:pPr/>
+      <w:pPr>
+        <w:keepNext/>
+      </w:pPr>
       <w:r>
         <w:t xml:space="preserve">Disclosures about Council, its employees and contractors (and all disclosures about Councillors) may also be made directly to:</w:t>
       </w:r>
@@ -4051,7 +4075,9 @@
       </w:r>
     </w:p>
     <w:p>
-      <w:pPr/>
+      <w:pPr>
+        <w:keepNext/>
+      </w:pPr>
       <w:r>
         <w:t xml:space="preserve">The Public Interest Disclosures Coordinator has a central role in Council’s internal reporting system and will:</w:t>
       </w:r>
@@ -4187,7 +4213,9 @@
       </w:r>
     </w:p>
     <w:p>
-      <w:pPr/>
+      <w:pPr>
+        <w:keepNext/>
+      </w:pPr>
       <w:r>
         <w:t xml:space="preserve">The Public Interest Disclosures Coordinator is currently:</w:t>
       </w:r>
@@ -4339,7 +4367,9 @@
       </w:r>
     </w:p>
     <w:p>
-      <w:pPr/>
+      <w:pPr>
+        <w:keepNext/>
+      </w:pPr>
       <w:r>
         <w:t xml:space="preserve">Council has appointed Public Interest Disclosures Officers to receive disclosures and provide general advice about the operation of the PID Act. They will:</w:t>
       </w:r>
@@ -4410,7 +4440,9 @@
       </w:r>
     </w:p>
     <w:p>
-      <w:pPr/>
+      <w:pPr>
+        <w:keepNext/>
+      </w:pPr>
       <w:r>
         <w:t xml:space="preserve">The Public Interest Disclosures Officers are:</w:t>
       </w:r>
@@ -4698,7 +4730,9 @@
       </w:r>
     </w:p>
     <w:p>
-      <w:pPr/>
+      <w:pPr>
+        <w:keepNext/>
+      </w:pPr>
       <w:r>
         <w:t xml:space="preserve">A manager or supervisor who receives a disclosure will:</w:t>
       </w:r>
@@ -4789,7 +4823,9 @@
       </w:r>
     </w:p>
     <w:p>
-      <w:pPr/>
+      <w:pPr>
+        <w:keepNext/>
+      </w:pPr>
       <w:r>
         <w:t xml:space="preserve">The Public Interest Disclosures Coordinator will assess whether the disclosure may be a public interest disclosure using the following two-step process:</w:t>
       </w:r>
@@ -5349,7 +5385,9 @@
       </w:r>
     </w:p>
     <w:p>
-      <w:pPr/>
+      <w:pPr>
+        <w:keepNext/>
+      </w:pPr>
       <w:r>
         <w:t xml:space="preserve">IBAC will advise the discloser (provided they are not anonymous) in writing that:</w:t>
       </w:r>
@@ -5414,7 +5452,9 @@
       </w:r>
     </w:p>
     <w:p>
-      <w:pPr/>
+      <w:pPr>
+        <w:keepNext/>
+      </w:pPr>
       <w:r>
         <w:t xml:space="preserve">IBAC will advise the discloser in writing that:</w:t>
       </w:r>
@@ -5607,6 +5647,7 @@
           </w:tcPr>
           <w:p>
             <w:pPr>
+              <w:keepNext/>
               <w:spacing w:before="40" w:after="40" w:line="252" w:lineRule="auto"/>
             </w:pPr>
             <w:r>
@@ -5624,6 +5665,7 @@
           </w:tcPr>
           <w:p>
             <w:pPr>
+              <w:keepNext/>
               <w:spacing w:before="40" w:after="40" w:line="252" w:lineRule="auto"/>
             </w:pPr>
             <w:r>
@@ -5641,6 +5683,7 @@
           </w:tcPr>
           <w:p>
             <w:pPr>
+              <w:keepNext/>
               <w:spacing w:before="40" w:after="40" w:line="252" w:lineRule="auto"/>
             </w:pPr>
             <w:r>
@@ -5663,6 +5706,7 @@
           </w:tcPr>
           <w:p>
             <w:pPr>
+              <w:keepNext/>
               <w:spacing w:before="40" w:after="40" w:line="252" w:lineRule="auto"/>
             </w:pPr>
             <w:r>
@@ -5680,6 +5724,7 @@
           </w:tcPr>
           <w:p>
             <w:pPr>
+              <w:keepNext/>
               <w:spacing w:before="40" w:after="40" w:line="252" w:lineRule="auto"/>
             </w:pPr>
             <w:r>
@@ -5697,6 +5742,7 @@
           </w:tcPr>
           <w:p>
             <w:pPr>
+              <w:keepNext/>
               <w:spacing w:before="40" w:after="40" w:line="252" w:lineRule="auto"/>
             </w:pPr>
             <w:r>
@@ -5719,6 +5765,7 @@
           </w:tcPr>
           <w:p>
             <w:pPr>
+              <w:keepNext/>
               <w:spacing w:before="40" w:after="40" w:line="252" w:lineRule="auto"/>
             </w:pPr>
             <w:r>
@@ -5736,6 +5783,7 @@
           </w:tcPr>
           <w:p>
             <w:pPr>
+              <w:keepNext/>
               <w:spacing w:before="40" w:after="40" w:line="252" w:lineRule="auto"/>
             </w:pPr>
             <w:r>
@@ -5753,6 +5801,7 @@
           </w:tcPr>
           <w:p>
             <w:pPr>
+              <w:keepNext/>
               <w:spacing w:before="40" w:after="40" w:line="252" w:lineRule="auto"/>
             </w:pPr>
             <w:r>
@@ -5775,6 +5824,7 @@
           </w:tcPr>
           <w:p>
             <w:pPr>
+              <w:keepNext/>
               <w:spacing w:before="40" w:after="40" w:line="252" w:lineRule="auto"/>
             </w:pPr>
             <w:r>
@@ -5792,6 +5842,7 @@
           </w:tcPr>
           <w:p>
             <w:pPr>
+              <w:keepNext/>
               <w:spacing w:before="40" w:after="40" w:line="252" w:lineRule="auto"/>
             </w:pPr>
             <w:r>
@@ -5809,6 +5860,7 @@
           </w:tcPr>
           <w:p>
             <w:pPr>
+              <w:keepNext/>
               <w:spacing w:before="40" w:after="40" w:line="252" w:lineRule="auto"/>
             </w:pPr>
             <w:r>
@@ -5831,6 +5883,7 @@
           </w:tcPr>
           <w:p>
             <w:pPr>
+              <w:keepNext/>
               <w:spacing w:before="40" w:after="40" w:line="252" w:lineRule="auto"/>
             </w:pPr>
             <w:r>
@@ -5848,6 +5901,7 @@
           </w:tcPr>
           <w:p>
             <w:pPr>
+              <w:keepNext/>
               <w:spacing w:before="40" w:after="40" w:line="252" w:lineRule="auto"/>
             </w:pPr>
             <w:r>
@@ -5865,6 +5919,7 @@
           </w:tcPr>
           <w:p>
             <w:pPr>
+              <w:keepNext/>
               <w:spacing w:before="40" w:after="40" w:line="252" w:lineRule="auto"/>
             </w:pPr>
             <w:r>
@@ -5887,6 +5942,7 @@
           </w:tcPr>
           <w:p>
             <w:pPr>
+              <w:keepNext/>
               <w:spacing w:before="40" w:after="40" w:line="252" w:lineRule="auto"/>
             </w:pPr>
             <w:r>
@@ -5904,6 +5960,7 @@
           </w:tcPr>
           <w:p>
             <w:pPr>
+              <w:keepNext/>
               <w:spacing w:before="40" w:after="40" w:line="252" w:lineRule="auto"/>
             </w:pPr>
             <w:r>
@@ -5921,6 +5978,7 @@
           </w:tcPr>
           <w:p>
             <w:pPr>
+              <w:keepNext/>
               <w:spacing w:before="40" w:after="40" w:line="252" w:lineRule="auto"/>
             </w:pPr>
             <w:r>
@@ -6009,7 +6067,9 @@
       </w:r>
     </w:p>
     <w:p>
-      <w:pPr/>
+      <w:pPr>
+        <w:keepNext/>
+      </w:pPr>
       <w:r>
         <w:t xml:space="preserve">Part 6 of the PID Act provides protections to anyone who makes a public interest disclosure or a misdirected disclosure. These protections apply from the time the disclosure is made, even if Council does not notify IBAC or IBAC determines it is not a public interest complaint. The protections include:</w:t>
       </w:r>
@@ -6102,7 +6162,9 @@
       </w:r>
     </w:p>
     <w:p>
-      <w:pPr/>
+      <w:pPr>
+        <w:keepNext/>
+      </w:pPr>
       <w:r>
         <w:t xml:space="preserve">Protections do not apply where a discloser:</w:t>
       </w:r>
@@ -6210,7 +6272,9 @@
       </w:r>
     </w:p>
     <w:p>
-      <w:pPr/>
+      <w:pPr>
+        <w:keepNext/>
+      </w:pPr>
       <w:r>
         <w:t xml:space="preserve">Council will ensure confidentiality by:</w:t>
       </w:r>
@@ -6302,7 +6366,9 @@
       </w:r>
     </w:p>
     <w:p>
-      <w:pPr/>
+      <w:pPr>
+        <w:keepNext/>
+      </w:pPr>
       <w:r>
         <w:t xml:space="preserve">Limited exceptions to the prohibition on disclosure are permitted by the Act, including where:</w:t>
       </w:r>
@@ -6457,7 +6523,9 @@
       </w:r>
     </w:p>
     <w:p>
-      <w:pPr/>
+      <w:pPr>
+        <w:keepNext/>
+      </w:pPr>
       <w:r>
         <w:t xml:space="preserve">Council is committed to protecting genuine disclosers and co-operators (persons who cooperate or intend to cooperate with an investigation) from detrimental action. Support will be provided regardless of whether the person is an employee or a member of the public, and includes:</w:t>
       </w:r>
@@ -6589,7 +6657,9 @@
       </w:r>
     </w:p>
     <w:p>
-      <w:pPr/>
+      <w:pPr>
+        <w:keepNext/>
+      </w:pPr>
       <w:r>
         <w:t xml:space="preserve">Council will also look after the welfare of any person who is the subject of a public interest disclosure. Until a public interest complaint is resolved, the information about the person is only an allegation. Council will:</w:t>
       </w:r>
@@ -6705,7 +6775,9 @@
       <w:bookmarkEnd w:id="9113"/>
     </w:p>
     <w:p>
-      <w:pPr/>
+      <w:pPr>
+        <w:keepNext/>
+      </w:pPr>
       <w:r>
         <w:t xml:space="preserve">Council will:</w:t>
       </w:r>

</xml_diff>